<commit_message>
Update content categories to 9-pillar structure and implement header dropdown
</commit_message>
<xml_diff>
--- a/Canadian_Optimizer_SOP.docx
+++ b/Canadian_Optimizer_SOP.docx
@@ -795,7 +795,7 @@
           <w:sz w:val="22"/>
           <w:szCs w:val="22"/>
         </w:rPr>
-        <w:t xml:space="preserve">The website organizes content across nine financial optimization categories. Each category focuses on specific strategies to optimize around that topic area.</w:t>
+        <w:t xml:space="preserve">The website organizes content across nine financial optimization categories. These categories were consolidated to eliminate overlap (e.g., Budgeting and Saving merged, Personal Finance removed as a standalone since the entire site is personal finance) while adding Insurance and Government Benefits as distinct high-value categories.</w:t>
       </w:r>
     </w:p>
     <w:p>
@@ -942,7 +942,7 @@
                 <w:sz w:val="20"/>
                 <w:szCs w:val="20"/>
               </w:rPr>
-              <w:t xml:space="preserve">Personal Finance</w:t>
+              <w:t xml:space="preserve">Investing</w:t>
             </w:r>
           </w:p>
         </w:tc>
@@ -970,7 +970,7 @@
                 <w:sz w:val="20"/>
                 <w:szCs w:val="20"/>
               </w:rPr>
-              <w:t xml:space="preserve">Overall financial optimization and planning</w:t>
+              <w:t xml:space="preserve">Portfolio strategy and wealth building</w:t>
             </w:r>
           </w:p>
         </w:tc>
@@ -998,7 +998,7 @@
                 <w:sz w:val="20"/>
                 <w:szCs w:val="20"/>
               </w:rPr>
-              <w:t xml:space="preserve">Net worth tracking, financial goal setting, optimizing cash flow</w:t>
+              <w:t xml:space="preserve">TFSA/RRSP optimization, ETF strategies, dividend investing, asset allocation</w:t>
             </w:r>
           </w:p>
         </w:tc>
@@ -1030,7 +1030,7 @@
                 <w:sz w:val="20"/>
                 <w:szCs w:val="20"/>
               </w:rPr>
-              <w:t xml:space="preserve">Investing</w:t>
+              <w:t xml:space="preserve">Taxes</w:t>
             </w:r>
           </w:p>
         </w:tc>
@@ -1058,7 +1058,7 @@
                 <w:sz w:val="20"/>
                 <w:szCs w:val="20"/>
               </w:rPr>
-              <w:t xml:space="preserve">Portfolio optimization and wealth building</w:t>
+              <w:t xml:space="preserve">Tax optimization and minimization</w:t>
             </w:r>
           </w:p>
         </w:tc>
@@ -1086,7 +1086,7 @@
                 <w:sz w:val="20"/>
                 <w:szCs w:val="20"/>
               </w:rPr>
-              <w:t xml:space="preserve">TFSA vs RRSP strategies, ETF optimization, dividend investing</w:t>
+              <w:t xml:space="preserve">Tax-loss harvesting, income splitting, deduction maximization, CRA strategies</w:t>
             </w:r>
           </w:p>
         </w:tc>
@@ -1118,7 +1118,7 @@
                 <w:sz w:val="20"/>
                 <w:szCs w:val="20"/>
               </w:rPr>
-              <w:t xml:space="preserve">Taxes</w:t>
+              <w:t xml:space="preserve">Real Estate</w:t>
             </w:r>
           </w:p>
         </w:tc>
@@ -1146,7 +1146,7 @@
                 <w:sz w:val="20"/>
                 <w:szCs w:val="20"/>
               </w:rPr>
-              <w:t xml:space="preserve">Tax optimization and minimization strategies</w:t>
+              <w:t xml:space="preserve">Property investment and homeownership optimization</w:t>
             </w:r>
           </w:p>
         </w:tc>
@@ -1174,7 +1174,7 @@
                 <w:sz w:val="20"/>
                 <w:szCs w:val="20"/>
               </w:rPr>
-              <w:t xml:space="preserve">Tax-loss harvesting, income splitting, deduction maximization</w:t>
+              <w:t xml:space="preserve">Mortgage optimization, rental income strategies, FHSA, property investment</w:t>
             </w:r>
           </w:p>
         </w:tc>
@@ -1206,7 +1206,7 @@
                 <w:sz w:val="20"/>
                 <w:szCs w:val="20"/>
               </w:rPr>
-              <w:t xml:space="preserve">Real Estate</w:t>
+              <w:t xml:space="preserve">Credit Cards</w:t>
             </w:r>
           </w:p>
         </w:tc>
@@ -1234,7 +1234,7 @@
                 <w:sz w:val="20"/>
                 <w:szCs w:val="20"/>
               </w:rPr>
-              <w:t xml:space="preserve">Property investment and homeownership optimization</w:t>
+              <w:t xml:space="preserve">Rewards maximization and credit optimization</w:t>
             </w:r>
           </w:p>
         </w:tc>
@@ -1262,7 +1262,7 @@
                 <w:sz w:val="20"/>
                 <w:szCs w:val="20"/>
               </w:rPr>
-              <w:t xml:space="preserve">Mortgage optimization, rental income strategies, FHSA</w:t>
+              <w:t xml:space="preserve">Points hacking, card churning, travel rewards optimization</w:t>
             </w:r>
           </w:p>
         </w:tc>
@@ -1294,7 +1294,7 @@
                 <w:sz w:val="20"/>
                 <w:szCs w:val="20"/>
               </w:rPr>
-              <w:t xml:space="preserve">Credit Cards</w:t>
+              <w:t xml:space="preserve">Retirement</w:t>
             </w:r>
           </w:p>
         </w:tc>
@@ -1322,7 +1322,7 @@
                 <w:sz w:val="20"/>
                 <w:szCs w:val="20"/>
               </w:rPr>
-              <w:t xml:space="preserve">Rewards maximization and credit optimization</w:t>
+              <w:t xml:space="preserve">Retirement income and withdrawal optimization</w:t>
             </w:r>
           </w:p>
         </w:tc>
@@ -1350,7 +1350,7 @@
                 <w:sz w:val="20"/>
                 <w:szCs w:val="20"/>
               </w:rPr>
-              <w:t xml:space="preserve">Points hacking, card churning, travel rewards optimization</w:t>
+              <w:t xml:space="preserve">CPP optimization, RRSP meltdown, pension income splitting, withdrawal strategies</w:t>
             </w:r>
           </w:p>
         </w:tc>
@@ -1382,7 +1382,7 @@
                 <w:sz w:val="20"/>
                 <w:szCs w:val="20"/>
               </w:rPr>
-              <w:t xml:space="preserve">Retirement Planning</w:t>
+              <w:t xml:space="preserve">Budgeting &amp; Saving</w:t>
             </w:r>
           </w:p>
         </w:tc>
@@ -1410,7 +1410,7 @@
                 <w:sz w:val="20"/>
                 <w:szCs w:val="20"/>
               </w:rPr>
-              <w:t xml:space="preserve">Retirement income and withdrawal optimization</w:t>
+              <w:t xml:space="preserve">Spending optimization and cost reduction</w:t>
             </w:r>
           </w:p>
         </w:tc>
@@ -1438,7 +1438,7 @@
                 <w:sz w:val="20"/>
                 <w:szCs w:val="20"/>
               </w:rPr>
-              <w:t xml:space="preserve">RRSP meltdown, CPP optimization, pension income splitting</w:t>
+              <w:t xml:space="preserve">Zero-based budgeting, expense automation, high-interest savings, subscription audits</w:t>
             </w:r>
           </w:p>
         </w:tc>
@@ -1470,7 +1470,7 @@
                 <w:sz w:val="20"/>
                 <w:szCs w:val="20"/>
               </w:rPr>
-              <w:t xml:space="preserve">Budgeting</w:t>
+              <w:t xml:space="preserve">Earning More</w:t>
             </w:r>
           </w:p>
         </w:tc>
@@ -1498,7 +1498,7 @@
                 <w:sz w:val="20"/>
                 <w:szCs w:val="20"/>
               </w:rPr>
-              <w:t xml:space="preserve">Spending optimization and financial tracking</w:t>
+              <w:t xml:space="preserve">Income optimization and side income strategies</w:t>
             </w:r>
           </w:p>
         </w:tc>
@@ -1526,7 +1526,7 @@
                 <w:sz w:val="20"/>
                 <w:szCs w:val="20"/>
               </w:rPr>
-              <w:t xml:space="preserve">Zero-based budgeting, expense optimization, automation</w:t>
+              <w:t xml:space="preserve">Side hustles, freelancing, passive income streams, salary negotiation</w:t>
             </w:r>
           </w:p>
         </w:tc>
@@ -1558,7 +1558,7 @@
                 <w:sz w:val="20"/>
                 <w:szCs w:val="20"/>
               </w:rPr>
-              <w:t xml:space="preserve">Saving Money</w:t>
+              <w:t xml:space="preserve">Insurance</w:t>
             </w:r>
           </w:p>
         </w:tc>
@@ -1586,7 +1586,7 @@
                 <w:sz w:val="20"/>
                 <w:szCs w:val="20"/>
               </w:rPr>
-              <w:t xml:space="preserve">Cost reduction and savings optimization</w:t>
+              <w:t xml:space="preserve">Insurance optimization and cost reduction</w:t>
             </w:r>
           </w:p>
         </w:tc>
@@ -1614,7 +1614,7 @@
                 <w:sz w:val="20"/>
                 <w:szCs w:val="20"/>
               </w:rPr>
-              <w:t xml:space="preserve">High-interest savings accounts, grocery hacks, subscription audits</w:t>
+              <w:t xml:space="preserve">Life, disability, home, auto insurance; bundling strategies; term vs. whole life; provincial differences</w:t>
             </w:r>
           </w:p>
         </w:tc>
@@ -1646,7 +1646,7 @@
                 <w:sz w:val="20"/>
                 <w:szCs w:val="20"/>
               </w:rPr>
-              <w:t xml:space="preserve">Making Money</w:t>
+              <w:t xml:space="preserve">Government Benefits</w:t>
             </w:r>
           </w:p>
         </w:tc>
@@ -1674,7 +1674,7 @@
                 <w:sz w:val="20"/>
                 <w:szCs w:val="20"/>
               </w:rPr>
-              <w:t xml:space="preserve">Income optimization and side income strategies</w:t>
+              <w:t xml:space="preserve">Maximizing Canadian government programs</w:t>
             </w:r>
           </w:p>
         </w:tc>
@@ -1702,7 +1702,7 @@
                 <w:sz w:val="20"/>
                 <w:szCs w:val="20"/>
               </w:rPr>
-              <w:t xml:space="preserve">Side hustles, freelancing, passive income streams</w:t>
+              <w:t xml:space="preserve">CPP timing, OAS clawback avoidance, CCB optimization, GST/HST credits, disability tax credit, provincial programs</w:t>
             </w:r>
           </w:p>
         </w:tc>
@@ -2068,7 +2068,7 @@
           <w:sz w:val="22"/>
           <w:szCs w:val="22"/>
         </w:rPr>
-        <w:t xml:space="preserve">Individual landing page for each of the 9 content categories</w:t>
+        <w:t xml:space="preserve">Individual landing page for each of the nine content categories</w:t>
       </w:r>
     </w:p>
     <w:p>

</xml_diff>